<commit_message>
update the report and code
</commit_message>
<xml_diff>
--- a/vmd-hd.docx
+++ b/vmd-hd.docx
@@ -2,6 +2,29 @@
 <file path=word/document.xml><?xml version="1.0" encoding="utf-8"?>
 <w:document xmlns:wpc="http://schemas.microsoft.com/office/word/2010/wordprocessingCanvas" xmlns:cx="http://schemas.microsoft.com/office/drawing/2014/chartex" xmlns:cx1="http://schemas.microsoft.com/office/drawing/2015/9/8/chartex" xmlns:cx2="http://schemas.microsoft.com/office/drawing/2015/10/21/chartex" xmlns:cx3="http://schemas.microsoft.com/office/drawing/2016/5/9/chartex" xmlns:cx4="http://schemas.microsoft.com/office/drawing/2016/5/10/chartex" xmlns:cx5="http://schemas.microsoft.com/office/drawing/2016/5/11/chartex" xmlns:cx6="http://schemas.microsoft.com/office/drawing/2016/5/12/chartex" xmlns:cx7="http://schemas.microsoft.com/office/drawing/2016/5/13/chartex" xmlns:cx8="http://schemas.microsoft.com/office/drawing/2016/5/14/chartex" xmlns:mc="http://schemas.openxmlformats.org/markup-compatibility/2006" xmlns:aink="http://schemas.microsoft.com/office/drawing/2016/ink" xmlns:am3d="http://schemas.microsoft.com/office/drawing/2017/model3d" xmlns:o="urn:schemas-microsoft-com:office:office" xmlns:oel="http://schemas.microsoft.com/office/2019/extlst" xmlns:r="http://schemas.openxmlformats.org/officeDocument/2006/relationships" xmlns:m="http://schemas.openxmlformats.org/officeDocument/2006/math" xmlns:v="urn:schemas-microsoft-com:vml" xmlns:wp14="http://schemas.microsoft.com/office/word/2010/wordprocessingDrawing" xmlns:wp="http://schemas.openxmlformats.org/drawingml/2006/wordprocessingDrawing" xmlns:w10="urn:schemas-microsoft-com:office:word" xmlns:w="http://schemas.openxmlformats.org/wordprocessingml/2006/main" xmlns:w14="http://schemas.microsoft.com/office/word/2010/wordml" xmlns:w15="http://schemas.microsoft.com/office/word/2012/wordml" xmlns:w16cex="http://schemas.microsoft.com/office/word/2018/wordml/cex" xmlns:w16cid="http://schemas.microsoft.com/office/word/2016/wordml/cid" xmlns:w16="http://schemas.microsoft.com/office/word/2018/wordml" xmlns:w16sdtdh="http://schemas.microsoft.com/office/word/2020/wordml/sdtdatahash" xmlns:w16se="http://schemas.microsoft.com/office/word/2015/wordml/symex" xmlns:wpg="http://schemas.microsoft.com/office/word/2010/wordprocessingGroup" xmlns:wpi="http://schemas.microsoft.com/office/word/2010/wordprocessingInk" xmlns:wne="http://schemas.microsoft.com/office/word/2006/wordml" xmlns:wps="http://schemas.microsoft.com/office/word/2010/wordprocessingShape" mc:Ignorable="w14 w15 w16se w16cid w16 w16cex w16sdtdh wp14">
   <w:body>
+    <w:p>
+      <w:pPr>
+        <w:spacing w:after="0" w:line="240" w:lineRule="auto"/>
+        <w:jc w:val="center"/>
+        <w:rPr>
+          <w:rFonts w:ascii="Times New Roman" w:eastAsia="Times New Roman" w:hAnsi="Times New Roman" w:cs="Times New Roman"/>
+          <w:kern w:val="0"/>
+          <w:sz w:val="24"/>
+          <w:szCs w:val="24"/>
+          <w14:ligatures w14:val="none"/>
+        </w:rPr>
+      </w:pPr>
+      <w:r>
+        <w:rPr>
+          <w:rFonts w:ascii="Times New Roman" w:eastAsia="Times New Roman" w:hAnsi="Times New Roman" w:cs="Times New Roman"/>
+          <w:kern w:val="0"/>
+          <w:sz w:val="24"/>
+          <w:szCs w:val="24"/>
+          <w14:ligatures w14:val="none"/>
+        </w:rPr>
+        <w:t>Keywords: noise removal, VMD, HD, 1D signal</w:t>
+      </w:r>
+    </w:p>
     <w:p>
       <w:pPr>
         <w:spacing w:after="0" w:line="240" w:lineRule="auto"/>
@@ -41,7 +64,7 @@
                     </pic:cNvPicPr>
                   </pic:nvPicPr>
                   <pic:blipFill>
-                    <a:blip r:embed="rId4">
+                    <a:blip r:embed="rId5">
                       <a:extLst>
                         <a:ext uri="{28A0092B-C50C-407E-A947-70E740481C1C}">
                           <a14:useLocalDpi xmlns:a14="http://schemas.microsoft.com/office/drawing/2010/main" val="0"/>
@@ -112,7 +135,7 @@
                     </pic:cNvPicPr>
                   </pic:nvPicPr>
                   <pic:blipFill>
-                    <a:blip r:embed="rId5">
+                    <a:blip r:embed="rId6">
                       <a:extLst>
                         <a:ext uri="{28A0092B-C50C-407E-A947-70E740481C1C}">
                           <a14:useLocalDpi xmlns:a14="http://schemas.microsoft.com/office/drawing/2010/main" val="0"/>
@@ -178,89 +201,6 @@
                 <pic:pic xmlns:pic="http://schemas.openxmlformats.org/drawingml/2006/picture">
                   <pic:nvPicPr>
                     <pic:cNvPr id="999602573" name="Picture 6" descr="A group of graphs of a function&#10;&#10;Description automatically generated"/>
-                    <pic:cNvPicPr>
-                      <a:picLocks noChangeAspect="1" noChangeArrowheads="1"/>
-                    </pic:cNvPicPr>
-                  </pic:nvPicPr>
-                  <pic:blipFill>
-                    <a:blip r:embed="rId6">
-                      <a:extLst>
-                        <a:ext uri="{28A0092B-C50C-407E-A947-70E740481C1C}">
-                          <a14:useLocalDpi xmlns:a14="http://schemas.microsoft.com/office/drawing/2010/main" val="0"/>
-                        </a:ext>
-                      </a:extLst>
-                    </a:blip>
-                    <a:srcRect/>
-                    <a:stretch>
-                      <a:fillRect/>
-                    </a:stretch>
-                  </pic:blipFill>
-                  <pic:spPr bwMode="auto">
-                    <a:xfrm>
-                      <a:off x="0" y="0"/>
-                      <a:ext cx="5943600" cy="4456430"/>
-                    </a:xfrm>
-                    <a:prstGeom prst="rect">
-                      <a:avLst/>
-                    </a:prstGeom>
-                    <a:noFill/>
-                    <a:ln>
-                      <a:noFill/>
-                    </a:ln>
-                  </pic:spPr>
-                </pic:pic>
-              </a:graphicData>
-            </a:graphic>
-          </wp:inline>
-        </w:drawing>
-      </w:r>
-    </w:p>
-    <w:p>
-      <w:pPr>
-        <w:spacing w:after="0" w:line="240" w:lineRule="auto"/>
-        <w:rPr>
-          <w:rFonts w:ascii="Times New Roman" w:eastAsia="Times New Roman" w:hAnsi="Times New Roman" w:cs="Times New Roman"/>
-          <w:kern w:val="0"/>
-          <w:sz w:val="24"/>
-          <w:szCs w:val="24"/>
-          <w14:ligatures w14:val="none"/>
-        </w:rPr>
-      </w:pPr>
-    </w:p>
-    <w:p>
-      <w:pPr>
-        <w:spacing w:after="0" w:line="240" w:lineRule="auto"/>
-        <w:rPr>
-          <w:rFonts w:ascii="Times New Roman" w:eastAsia="Times New Roman" w:hAnsi="Times New Roman" w:cs="Times New Roman"/>
-          <w:kern w:val="0"/>
-          <w:sz w:val="24"/>
-          <w:szCs w:val="24"/>
-          <w14:ligatures w14:val="none"/>
-        </w:rPr>
-      </w:pPr>
-      <w:r>
-        <w:rPr>
-          <w:rFonts w:ascii="Times New Roman" w:eastAsia="Times New Roman" w:hAnsi="Times New Roman" w:cs="Times New Roman"/>
-          <w:noProof/>
-          <w:kern w:val="0"/>
-          <w:sz w:val="24"/>
-          <w:szCs w:val="24"/>
-          <w14:ligatures w14:val="none"/>
-        </w:rPr>
-        <w:lastRenderedPageBreak/>
-        <w:drawing>
-          <wp:inline distT="0" distB="0" distL="0" distR="0" wp14:anchorId="79AA4392" wp14:editId="6B8FDE50">
-            <wp:extent cx="5943600" cy="4456430"/>
-            <wp:effectExtent l="0" t="0" r="0" b="1270"/>
-            <wp:docPr id="1687409785" name="Picture 4" descr="A graph with numbers and lines&#10;&#10;Description automatically generated"/>
-            <wp:cNvGraphicFramePr>
-              <a:graphicFrameLocks xmlns:a="http://schemas.openxmlformats.org/drawingml/2006/main" noChangeAspect="1"/>
-            </wp:cNvGraphicFramePr>
-            <a:graphic xmlns:a="http://schemas.openxmlformats.org/drawingml/2006/main">
-              <a:graphicData uri="http://schemas.openxmlformats.org/drawingml/2006/picture">
-                <pic:pic xmlns:pic="http://schemas.openxmlformats.org/drawingml/2006/picture">
-                  <pic:nvPicPr>
-                    <pic:cNvPr id="1687409785" name="Picture 4" descr="A graph with numbers and lines&#10;&#10;Description automatically generated"/>
                     <pic:cNvPicPr>
                       <a:picLocks noChangeAspect="1" noChangeArrowheads="1"/>
                     </pic:cNvPicPr>
@@ -309,6 +249,18 @@
           <w14:ligatures w14:val="none"/>
         </w:rPr>
       </w:pPr>
+    </w:p>
+    <w:p>
+      <w:pPr>
+        <w:spacing w:after="0" w:line="240" w:lineRule="auto"/>
+        <w:rPr>
+          <w:rFonts w:ascii="Times New Roman" w:eastAsia="Times New Roman" w:hAnsi="Times New Roman" w:cs="Times New Roman"/>
+          <w:kern w:val="0"/>
+          <w:sz w:val="24"/>
+          <w:szCs w:val="24"/>
+          <w14:ligatures w14:val="none"/>
+        </w:rPr>
+      </w:pPr>
       <w:r>
         <w:rPr>
           <w:rFonts w:ascii="Times New Roman" w:eastAsia="Times New Roman" w:hAnsi="Times New Roman" w:cs="Times New Roman"/>
@@ -320,10 +272,10 @@
         </w:rPr>
         <w:lastRenderedPageBreak/>
         <w:drawing>
-          <wp:inline distT="0" distB="0" distL="0" distR="0" wp14:anchorId="13EF3240" wp14:editId="220D1F62">
+          <wp:inline distT="0" distB="0" distL="0" distR="0" wp14:anchorId="79AA4392" wp14:editId="6B8FDE50">
             <wp:extent cx="5943600" cy="4456430"/>
             <wp:effectExtent l="0" t="0" r="0" b="1270"/>
-            <wp:docPr id="1736789952" name="Picture 3" descr="A graph with red and blue lines&#10;&#10;Description automatically generated"/>
+            <wp:docPr id="1687409785" name="Picture 4" descr="A graph with numbers and lines&#10;&#10;Description automatically generated"/>
             <wp:cNvGraphicFramePr>
               <a:graphicFrameLocks xmlns:a="http://schemas.openxmlformats.org/drawingml/2006/main" noChangeAspect="1"/>
             </wp:cNvGraphicFramePr>
@@ -331,7 +283,7 @@
               <a:graphicData uri="http://schemas.openxmlformats.org/drawingml/2006/picture">
                 <pic:pic xmlns:pic="http://schemas.openxmlformats.org/drawingml/2006/picture">
                   <pic:nvPicPr>
-                    <pic:cNvPr id="1736789952" name="Picture 3" descr="A graph with red and blue lines&#10;&#10;Description automatically generated"/>
+                    <pic:cNvPr id="1687409785" name="Picture 4" descr="A graph with numbers and lines&#10;&#10;Description automatically generated"/>
                     <pic:cNvPicPr>
                       <a:picLocks noChangeAspect="1" noChangeArrowheads="1"/>
                     </pic:cNvPicPr>
@@ -371,6 +323,77 @@
     </w:p>
     <w:p>
       <w:pPr>
+        <w:spacing w:after="0" w:line="240" w:lineRule="auto"/>
+        <w:rPr>
+          <w:rFonts w:ascii="Times New Roman" w:eastAsia="Times New Roman" w:hAnsi="Times New Roman" w:cs="Times New Roman"/>
+          <w:kern w:val="0"/>
+          <w:sz w:val="24"/>
+          <w:szCs w:val="24"/>
+          <w14:ligatures w14:val="none"/>
+        </w:rPr>
+      </w:pPr>
+      <w:r>
+        <w:rPr>
+          <w:rFonts w:ascii="Times New Roman" w:eastAsia="Times New Roman" w:hAnsi="Times New Roman" w:cs="Times New Roman"/>
+          <w:noProof/>
+          <w:kern w:val="0"/>
+          <w:sz w:val="24"/>
+          <w:szCs w:val="24"/>
+          <w14:ligatures w14:val="none"/>
+        </w:rPr>
+        <w:lastRenderedPageBreak/>
+        <w:drawing>
+          <wp:inline distT="0" distB="0" distL="0" distR="0" wp14:anchorId="13EF3240" wp14:editId="220D1F62">
+            <wp:extent cx="5943600" cy="4456430"/>
+            <wp:effectExtent l="0" t="0" r="0" b="1270"/>
+            <wp:docPr id="1736789952" name="Picture 3" descr="A graph with red and blue lines&#10;&#10;Description automatically generated"/>
+            <wp:cNvGraphicFramePr>
+              <a:graphicFrameLocks xmlns:a="http://schemas.openxmlformats.org/drawingml/2006/main" noChangeAspect="1"/>
+            </wp:cNvGraphicFramePr>
+            <a:graphic xmlns:a="http://schemas.openxmlformats.org/drawingml/2006/main">
+              <a:graphicData uri="http://schemas.openxmlformats.org/drawingml/2006/picture">
+                <pic:pic xmlns:pic="http://schemas.openxmlformats.org/drawingml/2006/picture">
+                  <pic:nvPicPr>
+                    <pic:cNvPr id="1736789952" name="Picture 3" descr="A graph with red and blue lines&#10;&#10;Description automatically generated"/>
+                    <pic:cNvPicPr>
+                      <a:picLocks noChangeAspect="1" noChangeArrowheads="1"/>
+                    </pic:cNvPicPr>
+                  </pic:nvPicPr>
+                  <pic:blipFill>
+                    <a:blip r:embed="rId9">
+                      <a:extLst>
+                        <a:ext uri="{28A0092B-C50C-407E-A947-70E740481C1C}">
+                          <a14:useLocalDpi xmlns:a14="http://schemas.microsoft.com/office/drawing/2010/main" val="0"/>
+                        </a:ext>
+                      </a:extLst>
+                    </a:blip>
+                    <a:srcRect/>
+                    <a:stretch>
+                      <a:fillRect/>
+                    </a:stretch>
+                  </pic:blipFill>
+                  <pic:spPr bwMode="auto">
+                    <a:xfrm>
+                      <a:off x="0" y="0"/>
+                      <a:ext cx="5943600" cy="4456430"/>
+                    </a:xfrm>
+                    <a:prstGeom prst="rect">
+                      <a:avLst/>
+                    </a:prstGeom>
+                    <a:noFill/>
+                    <a:ln>
+                      <a:noFill/>
+                    </a:ln>
+                  </pic:spPr>
+                </pic:pic>
+              </a:graphicData>
+            </a:graphic>
+          </wp:inline>
+        </w:drawing>
+      </w:r>
+    </w:p>
+    <w:p>
+      <w:pPr>
         <w:tabs>
           <w:tab w:val="left" w:pos="916"/>
           <w:tab w:val="left" w:pos="1832"/>
@@ -446,7 +469,37 @@
           <w:szCs w:val="24"/>
           <w14:ligatures w14:val="none"/>
         </w:rPr>
-        <w:t>theta = 0.3063</w:t>
+        <w:t xml:space="preserve">theta = </w:t>
+      </w:r>
+      <w:r>
+        <w:rPr>
+          <w:rFonts w:ascii="Courier New" w:eastAsia="Times New Roman" w:hAnsi="Courier New" w:cs="Courier New"/>
+          <w:kern w:val="0"/>
+          <w:sz w:val="24"/>
+          <w:szCs w:val="24"/>
+          <w14:ligatures w14:val="none"/>
+        </w:rPr>
+        <w:t>1</w:t>
+      </w:r>
+      <w:r>
+        <w:rPr>
+          <w:rFonts w:ascii="Courier New" w:eastAsia="Times New Roman" w:hAnsi="Courier New" w:cs="Courier New"/>
+          <w:kern w:val="0"/>
+          <w:sz w:val="24"/>
+          <w:szCs w:val="24"/>
+          <w14:ligatures w14:val="none"/>
+        </w:rPr>
+        <w:t>.</w:t>
+      </w:r>
+      <w:r>
+        <w:rPr>
+          <w:rFonts w:ascii="Courier New" w:eastAsia="Times New Roman" w:hAnsi="Courier New" w:cs="Courier New"/>
+          <w:kern w:val="0"/>
+          <w:sz w:val="24"/>
+          <w:szCs w:val="24"/>
+          <w14:ligatures w14:val="none"/>
+        </w:rPr>
+        <w:t>1216</w:t>
       </w:r>
     </w:p>
     <w:p>
@@ -480,7 +533,6 @@
           <w14:ligatures w14:val="none"/>
         </w:rPr>
       </w:pPr>
-      <w:proofErr w:type="spellStart"/>
       <w:r>
         <w:rPr>
           <w:rFonts w:ascii="Courier New" w:eastAsia="Times New Roman" w:hAnsi="Courier New" w:cs="Courier New"/>
@@ -491,9 +543,8 @@
           <w:szCs w:val="24"/>
           <w14:ligatures w14:val="none"/>
         </w:rPr>
-        <w:t>hdi</w:t>
-      </w:r>
-      <w:proofErr w:type="spellEnd"/>
+        <w:t xml:space="preserve">hdi = </w:t>
+      </w:r>
       <w:r>
         <w:rPr>
           <w:rFonts w:ascii="Courier New" w:eastAsia="Times New Roman" w:hAnsi="Courier New" w:cs="Courier New"/>
@@ -504,12 +555,13 @@
           <w:szCs w:val="24"/>
           <w14:ligatures w14:val="none"/>
         </w:rPr>
-        <w:t xml:space="preserve"> = 2</w:t>
+        <w:t>1</w:t>
       </w:r>
     </w:p>
     <w:p>
       <w:pPr>
         <w:spacing w:after="0" w:line="240" w:lineRule="auto"/>
+        <w:jc w:val="center"/>
         <w:rPr>
           <w:rFonts w:ascii="Times New Roman" w:eastAsia="Times New Roman" w:hAnsi="Times New Roman" w:cs="Times New Roman"/>
           <w:kern w:val="0"/>
@@ -529,10 +581,10 @@
         </w:rPr>
         <w:lastRenderedPageBreak/>
         <w:drawing>
-          <wp:inline distT="0" distB="0" distL="0" distR="0" wp14:anchorId="5A677E9D" wp14:editId="03605D8F">
-            <wp:extent cx="5217149" cy="4009668"/>
-            <wp:effectExtent l="0" t="0" r="3175" b="0"/>
-            <wp:docPr id="33909798" name="Picture 2" descr="A graph of a graph&#10;&#10;Description automatically generated"/>
+          <wp:inline distT="0" distB="0" distL="0" distR="0" wp14:anchorId="6BF78CAB" wp14:editId="0F6A845B">
+            <wp:extent cx="4620898" cy="3809916"/>
+            <wp:effectExtent l="0" t="0" r="8255" b="635"/>
+            <wp:docPr id="1926115594" name="Picture 1" descr="A graph of a graph&#10;&#10;Description automatically generated"/>
             <wp:cNvGraphicFramePr>
               <a:graphicFrameLocks xmlns:a="http://schemas.openxmlformats.org/drawingml/2006/main" noChangeAspect="1"/>
             </wp:cNvGraphicFramePr>
@@ -540,26 +592,26 @@
               <a:graphicData uri="http://schemas.openxmlformats.org/drawingml/2006/picture">
                 <pic:pic xmlns:pic="http://schemas.openxmlformats.org/drawingml/2006/picture">
                   <pic:nvPicPr>
-                    <pic:cNvPr id="33909798" name="Picture 2" descr="A graph of a graph&#10;&#10;Description automatically generated"/>
+                    <pic:cNvPr id="1926115594" name="Picture 1" descr="A graph of a graph&#10;&#10;Description automatically generated"/>
                     <pic:cNvPicPr>
                       <a:picLocks noChangeAspect="1" noChangeArrowheads="1"/>
                     </pic:cNvPicPr>
                   </pic:nvPicPr>
                   <pic:blipFill rotWithShape="1">
-                    <a:blip r:embed="rId9">
+                    <a:blip r:embed="rId10">
                       <a:extLst>
                         <a:ext uri="{28A0092B-C50C-407E-A947-70E740481C1C}">
                           <a14:useLocalDpi xmlns:a14="http://schemas.microsoft.com/office/drawing/2010/main" val="0"/>
                         </a:ext>
                       </a:extLst>
                     </a:blip>
-                    <a:srcRect l="4771" t="5267" r="7445" b="4753"/>
+                    <a:srcRect l="6665" t="2085" r="7610" b="3648"/>
                     <a:stretch/>
                   </pic:blipFill>
                   <pic:spPr bwMode="auto">
                     <a:xfrm>
                       <a:off x="0" y="0"/>
-                      <a:ext cx="5217443" cy="4009894"/>
+                      <a:ext cx="4628714" cy="3816360"/>
                     </a:xfrm>
                     <a:prstGeom prst="rect">
                       <a:avLst/>
@@ -592,6 +644,19 @@
           <w14:ligatures w14:val="none"/>
         </w:rPr>
       </w:pPr>
+    </w:p>
+    <w:p>
+      <w:pPr>
+        <w:spacing w:after="0" w:line="240" w:lineRule="auto"/>
+        <w:jc w:val="center"/>
+        <w:rPr>
+          <w:rFonts w:ascii="Times New Roman" w:eastAsia="Times New Roman" w:hAnsi="Times New Roman" w:cs="Times New Roman"/>
+          <w:kern w:val="0"/>
+          <w:sz w:val="24"/>
+          <w:szCs w:val="24"/>
+          <w14:ligatures w14:val="none"/>
+        </w:rPr>
+      </w:pPr>
       <w:r>
         <w:rPr>
           <w:rFonts w:ascii="Times New Roman" w:eastAsia="Times New Roman" w:hAnsi="Times New Roman" w:cs="Times New Roman"/>
@@ -602,10 +667,10 @@
           <w14:ligatures w14:val="none"/>
         </w:rPr>
         <w:drawing>
-          <wp:inline distT="0" distB="0" distL="0" distR="0" wp14:anchorId="4F71442C" wp14:editId="3F279885">
-            <wp:extent cx="5402451" cy="4211320"/>
-            <wp:effectExtent l="0" t="0" r="8255" b="0"/>
-            <wp:docPr id="1083162991" name="Picture 1" descr="A graph of a graph&#10;&#10;Description automatically generated"/>
+          <wp:inline distT="0" distB="0" distL="0" distR="0" wp14:anchorId="18EEAAEC" wp14:editId="25A63600">
+            <wp:extent cx="4921678" cy="4028424"/>
+            <wp:effectExtent l="0" t="0" r="0" b="0"/>
+            <wp:docPr id="1848271466" name="Picture 2" descr="A graph with lines and numbers&#10;&#10;Description automatically generated"/>
             <wp:cNvGraphicFramePr>
               <a:graphicFrameLocks xmlns:a="http://schemas.openxmlformats.org/drawingml/2006/main" noChangeAspect="1"/>
             </wp:cNvGraphicFramePr>
@@ -613,26 +678,26 @@
               <a:graphicData uri="http://schemas.openxmlformats.org/drawingml/2006/picture">
                 <pic:pic xmlns:pic="http://schemas.openxmlformats.org/drawingml/2006/picture">
                   <pic:nvPicPr>
-                    <pic:cNvPr id="1083162991" name="Picture 1" descr="A graph of a graph&#10;&#10;Description automatically generated"/>
+                    <pic:cNvPr id="1848271466" name="Picture 2" descr="A graph with lines and numbers&#10;&#10;Description automatically generated"/>
                     <pic:cNvPicPr>
                       <a:picLocks noChangeAspect="1" noChangeArrowheads="1"/>
                     </pic:cNvPicPr>
                   </pic:nvPicPr>
                   <pic:blipFill rotWithShape="1">
-                    <a:blip r:embed="rId10">
+                    <a:blip r:embed="rId11">
                       <a:extLst>
                         <a:ext uri="{28A0092B-C50C-407E-A947-70E740481C1C}">
                           <a14:useLocalDpi xmlns:a14="http://schemas.microsoft.com/office/drawing/2010/main" val="0"/>
                         </a:ext>
                       </a:extLst>
                     </a:blip>
-                    <a:srcRect l="3210" t="5486" r="5882"/>
+                    <a:srcRect l="3786" t="2195" r="6859" b="259"/>
                     <a:stretch/>
                   </pic:blipFill>
                   <pic:spPr bwMode="auto">
                     <a:xfrm>
                       <a:off x="0" y="0"/>
-                      <a:ext cx="5403244" cy="4211938"/>
+                      <a:ext cx="4931409" cy="4036389"/>
                     </a:xfrm>
                     <a:prstGeom prst="rect">
                       <a:avLst/>
@@ -654,6 +719,817 @@
         </w:drawing>
       </w:r>
     </w:p>
+    <w:p>
+      <w:pPr>
+        <w:spacing w:after="0" w:line="240" w:lineRule="auto"/>
+        <w:rPr>
+          <w:rFonts w:ascii="Times New Roman" w:eastAsia="Times New Roman" w:hAnsi="Times New Roman" w:cs="Times New Roman"/>
+          <w:kern w:val="0"/>
+          <w:sz w:val="24"/>
+          <w:szCs w:val="24"/>
+          <w14:ligatures w14:val="none"/>
+        </w:rPr>
+      </w:pPr>
+    </w:p>
+    <w:p>
+      <w:pPr>
+        <w:spacing w:after="0" w:line="240" w:lineRule="auto"/>
+        <w:rPr>
+          <w:rFonts w:ascii="Times New Roman" w:eastAsia="Times New Roman" w:hAnsi="Times New Roman" w:cs="Times New Roman"/>
+          <w:kern w:val="0"/>
+          <w:sz w:val="24"/>
+          <w:szCs w:val="24"/>
+          <w14:ligatures w14:val="none"/>
+        </w:rPr>
+      </w:pPr>
+    </w:p>
+    <w:tbl>
+      <w:tblPr>
+        <w:tblStyle w:val="TableGrid"/>
+        <w:tblW w:w="0" w:type="auto"/>
+        <w:tblLook w:val="04A0" w:firstRow="1" w:lastRow="0" w:firstColumn="1" w:lastColumn="0" w:noHBand="0" w:noVBand="1"/>
+      </w:tblPr>
+      <w:tblGrid>
+        <w:gridCol w:w="3097"/>
+        <w:gridCol w:w="2955"/>
+        <w:gridCol w:w="3298"/>
+      </w:tblGrid>
+      <w:tr>
+        <w:trPr>
+          <w:trHeight w:val="2591"/>
+        </w:trPr>
+        <w:tc>
+          <w:tcPr>
+            <w:tcW w:w="3116" w:type="dxa"/>
+          </w:tcPr>
+          <w:p>
+            <w:pPr>
+              <w:rPr>
+                <w:rFonts w:ascii="Times New Roman" w:eastAsia="Times New Roman" w:hAnsi="Times New Roman" w:cs="Times New Roman"/>
+                <w:kern w:val="0"/>
+                <w:sz w:val="24"/>
+                <w:szCs w:val="24"/>
+                <w14:ligatures w14:val="none"/>
+              </w:rPr>
+            </w:pPr>
+            <w:r>
+              <w:rPr>
+                <w:rFonts w:ascii="Times New Roman" w:eastAsia="Times New Roman" w:hAnsi="Times New Roman" w:cs="Times New Roman"/>
+                <w:noProof/>
+                <w:kern w:val="0"/>
+                <w:sz w:val="24"/>
+                <w:szCs w:val="24"/>
+                <w14:ligatures w14:val="none"/>
+              </w:rPr>
+              <w:drawing>
+                <wp:inline distT="0" distB="0" distL="0" distR="0" wp14:anchorId="3220FD20" wp14:editId="2ED63729">
+                  <wp:extent cx="1877698" cy="1544737"/>
+                  <wp:effectExtent l="0" t="0" r="8255" b="0"/>
+                  <wp:docPr id="431379381" name="Picture 12"/>
+                  <wp:cNvGraphicFramePr>
+                    <a:graphicFrameLocks xmlns:a="http://schemas.openxmlformats.org/drawingml/2006/main" noChangeAspect="1"/>
+                  </wp:cNvGraphicFramePr>
+                  <a:graphic xmlns:a="http://schemas.openxmlformats.org/drawingml/2006/main">
+                    <a:graphicData uri="http://schemas.openxmlformats.org/drawingml/2006/picture">
+                      <pic:pic xmlns:pic="http://schemas.openxmlformats.org/drawingml/2006/picture">
+                        <pic:nvPicPr>
+                          <pic:cNvPr id="0" name="Picture 23"/>
+                          <pic:cNvPicPr>
+                            <a:picLocks noChangeAspect="1" noChangeArrowheads="1"/>
+                          </pic:cNvPicPr>
+                        </pic:nvPicPr>
+                        <pic:blipFill rotWithShape="1">
+                          <a:blip r:embed="rId12" cstate="print">
+                            <a:extLst>
+                              <a:ext uri="{28A0092B-C50C-407E-A947-70E740481C1C}">
+                                <a14:useLocalDpi xmlns:a14="http://schemas.microsoft.com/office/drawing/2010/main" val="0"/>
+                              </a:ext>
+                            </a:extLst>
+                          </a:blip>
+                          <a:srcRect l="2846" r="6039"/>
+                          <a:stretch/>
+                        </pic:blipFill>
+                        <pic:spPr bwMode="auto">
+                          <a:xfrm>
+                            <a:off x="0" y="0"/>
+                            <a:ext cx="1900848" cy="1563782"/>
+                          </a:xfrm>
+                          <a:prstGeom prst="rect">
+                            <a:avLst/>
+                          </a:prstGeom>
+                          <a:noFill/>
+                          <a:ln>
+                            <a:noFill/>
+                          </a:ln>
+                          <a:extLst>
+                            <a:ext uri="{53640926-AAD7-44D8-BBD7-CCE9431645EC}">
+                              <a14:shadowObscured xmlns:a14="http://schemas.microsoft.com/office/drawing/2010/main"/>
+                            </a:ext>
+                          </a:extLst>
+                        </pic:spPr>
+                      </pic:pic>
+                    </a:graphicData>
+                  </a:graphic>
+                </wp:inline>
+              </w:drawing>
+            </w:r>
+          </w:p>
+        </w:tc>
+        <w:tc>
+          <w:tcPr>
+            <w:tcW w:w="3117" w:type="dxa"/>
+          </w:tcPr>
+          <w:p>
+            <w:pPr>
+              <w:rPr>
+                <w:rFonts w:ascii="Times New Roman" w:eastAsia="Times New Roman" w:hAnsi="Times New Roman" w:cs="Times New Roman"/>
+                <w:kern w:val="0"/>
+                <w:sz w:val="24"/>
+                <w:szCs w:val="24"/>
+                <w14:ligatures w14:val="none"/>
+              </w:rPr>
+            </w:pPr>
+            <w:r>
+              <w:rPr>
+                <w:rFonts w:ascii="Times New Roman" w:eastAsia="Times New Roman" w:hAnsi="Times New Roman" w:cs="Times New Roman"/>
+                <w:noProof/>
+                <w:kern w:val="0"/>
+                <w:sz w:val="24"/>
+                <w:szCs w:val="24"/>
+                <w14:ligatures w14:val="none"/>
+              </w:rPr>
+              <w:drawing>
+                <wp:inline distT="0" distB="0" distL="0" distR="0" wp14:anchorId="43E7927D" wp14:editId="167FB42F">
+                  <wp:extent cx="1794571" cy="1537220"/>
+                  <wp:effectExtent l="0" t="0" r="0" b="6350"/>
+                  <wp:docPr id="1674175366" name="Picture 7"/>
+                  <wp:cNvGraphicFramePr>
+                    <a:graphicFrameLocks xmlns:a="http://schemas.openxmlformats.org/drawingml/2006/main" noChangeAspect="1"/>
+                  </wp:cNvGraphicFramePr>
+                  <a:graphic xmlns:a="http://schemas.openxmlformats.org/drawingml/2006/main">
+                    <a:graphicData uri="http://schemas.openxmlformats.org/drawingml/2006/picture">
+                      <pic:pic xmlns:pic="http://schemas.openxmlformats.org/drawingml/2006/picture">
+                        <pic:nvPicPr>
+                          <pic:cNvPr id="0" name="Picture 13"/>
+                          <pic:cNvPicPr>
+                            <a:picLocks noChangeAspect="1" noChangeArrowheads="1"/>
+                          </pic:cNvPicPr>
+                        </pic:nvPicPr>
+                        <pic:blipFill rotWithShape="1">
+                          <a:blip r:embed="rId13" cstate="print">
+                            <a:extLst>
+                              <a:ext uri="{28A0092B-C50C-407E-A947-70E740481C1C}">
+                                <a14:useLocalDpi xmlns:a14="http://schemas.microsoft.com/office/drawing/2010/main" val="0"/>
+                              </a:ext>
+                            </a:extLst>
+                          </a:blip>
+                          <a:srcRect l="6676" r="5819"/>
+                          <a:stretch/>
+                        </pic:blipFill>
+                        <pic:spPr bwMode="auto">
+                          <a:xfrm>
+                            <a:off x="0" y="0"/>
+                            <a:ext cx="1802222" cy="1543774"/>
+                          </a:xfrm>
+                          <a:prstGeom prst="rect">
+                            <a:avLst/>
+                          </a:prstGeom>
+                          <a:noFill/>
+                          <a:ln>
+                            <a:noFill/>
+                          </a:ln>
+                          <a:extLst>
+                            <a:ext uri="{53640926-AAD7-44D8-BBD7-CCE9431645EC}">
+                              <a14:shadowObscured xmlns:a14="http://schemas.microsoft.com/office/drawing/2010/main"/>
+                            </a:ext>
+                          </a:extLst>
+                        </pic:spPr>
+                      </pic:pic>
+                    </a:graphicData>
+                  </a:graphic>
+                </wp:inline>
+              </w:drawing>
+            </w:r>
+          </w:p>
+        </w:tc>
+        <w:tc>
+          <w:tcPr>
+            <w:tcW w:w="3117" w:type="dxa"/>
+          </w:tcPr>
+          <w:p>
+            <w:pPr>
+              <w:rPr>
+                <w:rFonts w:ascii="Times New Roman" w:eastAsia="Times New Roman" w:hAnsi="Times New Roman" w:cs="Times New Roman"/>
+                <w:kern w:val="0"/>
+                <w:sz w:val="24"/>
+                <w:szCs w:val="24"/>
+                <w14:ligatures w14:val="none"/>
+              </w:rPr>
+            </w:pPr>
+            <w:r>
+              <w:rPr>
+                <w:rFonts w:ascii="Times New Roman" w:eastAsia="Times New Roman" w:hAnsi="Times New Roman" w:cs="Times New Roman"/>
+                <w:noProof/>
+                <w:kern w:val="0"/>
+                <w:sz w:val="24"/>
+                <w:szCs w:val="24"/>
+                <w14:ligatures w14:val="none"/>
+              </w:rPr>
+              <w:drawing>
+                <wp:inline distT="0" distB="0" distL="0" distR="0" wp14:anchorId="67BBA19C" wp14:editId="36AFEF65">
+                  <wp:extent cx="1951046" cy="1580912"/>
+                  <wp:effectExtent l="0" t="0" r="0" b="635"/>
+                  <wp:docPr id="1292302616" name="Picture 5"/>
+                  <wp:cNvGraphicFramePr>
+                    <a:graphicFrameLocks xmlns:a="http://schemas.openxmlformats.org/drawingml/2006/main" noChangeAspect="1"/>
+                  </wp:cNvGraphicFramePr>
+                  <a:graphic xmlns:a="http://schemas.openxmlformats.org/drawingml/2006/main">
+                    <a:graphicData uri="http://schemas.openxmlformats.org/drawingml/2006/picture">
+                      <pic:pic xmlns:pic="http://schemas.openxmlformats.org/drawingml/2006/picture">
+                        <pic:nvPicPr>
+                          <pic:cNvPr id="0" name="Picture 9"/>
+                          <pic:cNvPicPr>
+                            <a:picLocks noChangeAspect="1" noChangeArrowheads="1"/>
+                          </pic:cNvPicPr>
+                        </pic:nvPicPr>
+                        <pic:blipFill rotWithShape="1">
+                          <a:blip r:embed="rId14" cstate="print">
+                            <a:extLst>
+                              <a:ext uri="{28A0092B-C50C-407E-A947-70E740481C1C}">
+                                <a14:useLocalDpi xmlns:a14="http://schemas.microsoft.com/office/drawing/2010/main" val="0"/>
+                              </a:ext>
+                            </a:extLst>
+                          </a:blip>
+                          <a:srcRect l="2782" r="4712"/>
+                          <a:stretch/>
+                        </pic:blipFill>
+                        <pic:spPr bwMode="auto">
+                          <a:xfrm>
+                            <a:off x="0" y="0"/>
+                            <a:ext cx="1966466" cy="1593406"/>
+                          </a:xfrm>
+                          <a:prstGeom prst="rect">
+                            <a:avLst/>
+                          </a:prstGeom>
+                          <a:noFill/>
+                          <a:ln>
+                            <a:noFill/>
+                          </a:ln>
+                          <a:extLst>
+                            <a:ext uri="{53640926-AAD7-44D8-BBD7-CCE9431645EC}">
+                              <a14:shadowObscured xmlns:a14="http://schemas.microsoft.com/office/drawing/2010/main"/>
+                            </a:ext>
+                          </a:extLst>
+                        </pic:spPr>
+                      </pic:pic>
+                    </a:graphicData>
+                  </a:graphic>
+                </wp:inline>
+              </w:drawing>
+            </w:r>
+          </w:p>
+        </w:tc>
+      </w:tr>
+      <w:tr>
+        <w:trPr>
+          <w:trHeight w:val="2591"/>
+        </w:trPr>
+        <w:tc>
+          <w:tcPr>
+            <w:tcW w:w="3116" w:type="dxa"/>
+          </w:tcPr>
+          <w:p>
+            <w:pPr>
+              <w:rPr>
+                <w:rFonts w:ascii="Times New Roman" w:eastAsia="Times New Roman" w:hAnsi="Times New Roman" w:cs="Times New Roman"/>
+                <w:kern w:val="0"/>
+                <w:sz w:val="24"/>
+                <w:szCs w:val="24"/>
+                <w14:ligatures w14:val="none"/>
+              </w:rPr>
+            </w:pPr>
+            <w:r>
+              <w:rPr>
+                <w:rFonts w:ascii="Times New Roman" w:eastAsia="Times New Roman" w:hAnsi="Times New Roman" w:cs="Times New Roman"/>
+                <w:noProof/>
+                <w:kern w:val="0"/>
+                <w:sz w:val="24"/>
+                <w:szCs w:val="24"/>
+                <w14:ligatures w14:val="none"/>
+              </w:rPr>
+              <w:drawing>
+                <wp:inline distT="0" distB="0" distL="0" distR="0" wp14:anchorId="1B998855" wp14:editId="6A789417">
+                  <wp:extent cx="1887478" cy="1555684"/>
+                  <wp:effectExtent l="0" t="0" r="0" b="6985"/>
+                  <wp:docPr id="41637580" name="Picture 11"/>
+                  <wp:cNvGraphicFramePr>
+                    <a:graphicFrameLocks xmlns:a="http://schemas.openxmlformats.org/drawingml/2006/main" noChangeAspect="1"/>
+                  </wp:cNvGraphicFramePr>
+                  <a:graphic xmlns:a="http://schemas.openxmlformats.org/drawingml/2006/main">
+                    <a:graphicData uri="http://schemas.openxmlformats.org/drawingml/2006/picture">
+                      <pic:pic xmlns:pic="http://schemas.openxmlformats.org/drawingml/2006/picture">
+                        <pic:nvPicPr>
+                          <pic:cNvPr id="0" name="Picture 21"/>
+                          <pic:cNvPicPr>
+                            <a:picLocks noChangeAspect="1" noChangeArrowheads="1"/>
+                          </pic:cNvPicPr>
+                        </pic:nvPicPr>
+                        <pic:blipFill rotWithShape="1">
+                          <a:blip r:embed="rId15" cstate="print">
+                            <a:extLst>
+                              <a:ext uri="{28A0092B-C50C-407E-A947-70E740481C1C}">
+                                <a14:useLocalDpi xmlns:a14="http://schemas.microsoft.com/office/drawing/2010/main" val="0"/>
+                              </a:ext>
+                            </a:extLst>
+                          </a:blip>
+                          <a:srcRect l="2827" r="6229"/>
+                          <a:stretch/>
+                        </pic:blipFill>
+                        <pic:spPr bwMode="auto">
+                          <a:xfrm>
+                            <a:off x="0" y="0"/>
+                            <a:ext cx="1917424" cy="1580366"/>
+                          </a:xfrm>
+                          <a:prstGeom prst="rect">
+                            <a:avLst/>
+                          </a:prstGeom>
+                          <a:noFill/>
+                          <a:ln>
+                            <a:noFill/>
+                          </a:ln>
+                          <a:extLst>
+                            <a:ext uri="{53640926-AAD7-44D8-BBD7-CCE9431645EC}">
+                              <a14:shadowObscured xmlns:a14="http://schemas.microsoft.com/office/drawing/2010/main"/>
+                            </a:ext>
+                          </a:extLst>
+                        </pic:spPr>
+                      </pic:pic>
+                    </a:graphicData>
+                  </a:graphic>
+                </wp:inline>
+              </w:drawing>
+            </w:r>
+          </w:p>
+        </w:tc>
+        <w:tc>
+          <w:tcPr>
+            <w:tcW w:w="3117" w:type="dxa"/>
+          </w:tcPr>
+          <w:p>
+            <w:pPr>
+              <w:rPr>
+                <w:rFonts w:ascii="Times New Roman" w:eastAsia="Times New Roman" w:hAnsi="Times New Roman" w:cs="Times New Roman"/>
+                <w:kern w:val="0"/>
+                <w:sz w:val="24"/>
+                <w:szCs w:val="24"/>
+                <w14:ligatures w14:val="none"/>
+              </w:rPr>
+            </w:pPr>
+            <w:r>
+              <w:rPr>
+                <w:rFonts w:ascii="Times New Roman" w:eastAsia="Times New Roman" w:hAnsi="Times New Roman" w:cs="Times New Roman"/>
+                <w:noProof/>
+                <w:kern w:val="0"/>
+                <w:sz w:val="24"/>
+                <w:szCs w:val="24"/>
+                <w14:ligatures w14:val="none"/>
+              </w:rPr>
+              <w:drawing>
+                <wp:inline distT="0" distB="0" distL="0" distR="0" wp14:anchorId="77017C70" wp14:editId="695C21DF">
+                  <wp:extent cx="1784791" cy="1556899"/>
+                  <wp:effectExtent l="0" t="0" r="6350" b="5715"/>
+                  <wp:docPr id="1549086806" name="Picture 9"/>
+                  <wp:cNvGraphicFramePr>
+                    <a:graphicFrameLocks xmlns:a="http://schemas.openxmlformats.org/drawingml/2006/main" noChangeAspect="1"/>
+                  </wp:cNvGraphicFramePr>
+                  <a:graphic xmlns:a="http://schemas.openxmlformats.org/drawingml/2006/main">
+                    <a:graphicData uri="http://schemas.openxmlformats.org/drawingml/2006/picture">
+                      <pic:pic xmlns:pic="http://schemas.openxmlformats.org/drawingml/2006/picture">
+                        <pic:nvPicPr>
+                          <pic:cNvPr id="0" name="Picture 17"/>
+                          <pic:cNvPicPr>
+                            <a:picLocks noChangeAspect="1" noChangeArrowheads="1"/>
+                          </pic:cNvPicPr>
+                        </pic:nvPicPr>
+                        <pic:blipFill rotWithShape="1">
+                          <a:blip r:embed="rId16" cstate="print">
+                            <a:extLst>
+                              <a:ext uri="{28A0092B-C50C-407E-A947-70E740481C1C}">
+                                <a14:useLocalDpi xmlns:a14="http://schemas.microsoft.com/office/drawing/2010/main" val="0"/>
+                              </a:ext>
+                            </a:extLst>
+                          </a:blip>
+                          <a:srcRect l="7060" r="7010"/>
+                          <a:stretch/>
+                        </pic:blipFill>
+                        <pic:spPr bwMode="auto">
+                          <a:xfrm>
+                            <a:off x="0" y="0"/>
+                            <a:ext cx="1808385" cy="1577480"/>
+                          </a:xfrm>
+                          <a:prstGeom prst="rect">
+                            <a:avLst/>
+                          </a:prstGeom>
+                          <a:noFill/>
+                          <a:ln>
+                            <a:noFill/>
+                          </a:ln>
+                          <a:extLst>
+                            <a:ext uri="{53640926-AAD7-44D8-BBD7-CCE9431645EC}">
+                              <a14:shadowObscured xmlns:a14="http://schemas.microsoft.com/office/drawing/2010/main"/>
+                            </a:ext>
+                          </a:extLst>
+                        </pic:spPr>
+                      </pic:pic>
+                    </a:graphicData>
+                  </a:graphic>
+                </wp:inline>
+              </w:drawing>
+            </w:r>
+          </w:p>
+        </w:tc>
+        <w:tc>
+          <w:tcPr>
+            <w:tcW w:w="3117" w:type="dxa"/>
+          </w:tcPr>
+          <w:p>
+            <w:pPr>
+              <w:rPr>
+                <w:rFonts w:ascii="Times New Roman" w:eastAsia="Times New Roman" w:hAnsi="Times New Roman" w:cs="Times New Roman"/>
+                <w:kern w:val="0"/>
+                <w:sz w:val="24"/>
+                <w:szCs w:val="24"/>
+                <w14:ligatures w14:val="none"/>
+              </w:rPr>
+            </w:pPr>
+            <w:r>
+              <w:rPr>
+                <w:rFonts w:ascii="Times New Roman" w:eastAsia="Times New Roman" w:hAnsi="Times New Roman" w:cs="Times New Roman"/>
+                <w:noProof/>
+                <w:kern w:val="0"/>
+                <w:sz w:val="24"/>
+                <w:szCs w:val="24"/>
+                <w14:ligatures w14:val="none"/>
+              </w:rPr>
+              <w:drawing>
+                <wp:inline distT="0" distB="0" distL="0" distR="0" wp14:anchorId="35ABBC04" wp14:editId="6337A905">
+                  <wp:extent cx="2014614" cy="1584960"/>
+                  <wp:effectExtent l="0" t="0" r="5080" b="0"/>
+                  <wp:docPr id="453334306" name="Picture 10"/>
+                  <wp:cNvGraphicFramePr>
+                    <a:graphicFrameLocks xmlns:a="http://schemas.openxmlformats.org/drawingml/2006/main" noChangeAspect="1"/>
+                  </wp:cNvGraphicFramePr>
+                  <a:graphic xmlns:a="http://schemas.openxmlformats.org/drawingml/2006/main">
+                    <a:graphicData uri="http://schemas.openxmlformats.org/drawingml/2006/picture">
+                      <pic:pic xmlns:pic="http://schemas.openxmlformats.org/drawingml/2006/picture">
+                        <pic:nvPicPr>
+                          <pic:cNvPr id="0" name="Picture 19"/>
+                          <pic:cNvPicPr>
+                            <a:picLocks noChangeAspect="1" noChangeArrowheads="1"/>
+                          </pic:cNvPicPr>
+                        </pic:nvPicPr>
+                        <pic:blipFill rotWithShape="1">
+                          <a:blip r:embed="rId17" cstate="print">
+                            <a:extLst>
+                              <a:ext uri="{28A0092B-C50C-407E-A947-70E740481C1C}">
+                                <a14:useLocalDpi xmlns:a14="http://schemas.microsoft.com/office/drawing/2010/main" val="0"/>
+                              </a:ext>
+                            </a:extLst>
+                          </a:blip>
+                          <a:srcRect r="4723"/>
+                          <a:stretch/>
+                        </pic:blipFill>
+                        <pic:spPr bwMode="auto">
+                          <a:xfrm>
+                            <a:off x="0" y="0"/>
+                            <a:ext cx="2028301" cy="1595728"/>
+                          </a:xfrm>
+                          <a:prstGeom prst="rect">
+                            <a:avLst/>
+                          </a:prstGeom>
+                          <a:noFill/>
+                          <a:ln>
+                            <a:noFill/>
+                          </a:ln>
+                          <a:extLst>
+                            <a:ext uri="{53640926-AAD7-44D8-BBD7-CCE9431645EC}">
+                              <a14:shadowObscured xmlns:a14="http://schemas.microsoft.com/office/drawing/2010/main"/>
+                            </a:ext>
+                          </a:extLst>
+                        </pic:spPr>
+                      </pic:pic>
+                    </a:graphicData>
+                  </a:graphic>
+                </wp:inline>
+              </w:drawing>
+            </w:r>
+          </w:p>
+        </w:tc>
+      </w:tr>
+    </w:tbl>
+    <w:p>
+      <w:pPr>
+        <w:spacing w:after="0" w:line="240" w:lineRule="auto"/>
+        <w:rPr>
+          <w:rFonts w:ascii="Times New Roman" w:eastAsia="Times New Roman" w:hAnsi="Times New Roman" w:cs="Times New Roman"/>
+          <w:kern w:val="0"/>
+          <w:sz w:val="24"/>
+          <w:szCs w:val="24"/>
+          <w14:ligatures w14:val="none"/>
+        </w:rPr>
+      </w:pPr>
+    </w:p>
+    <w:p>
+      <w:pPr>
+        <w:spacing w:after="0" w:line="240" w:lineRule="auto"/>
+        <w:rPr>
+          <w:rFonts w:ascii="Times New Roman" w:eastAsia="Times New Roman" w:hAnsi="Times New Roman" w:cs="Times New Roman"/>
+          <w:kern w:val="0"/>
+          <w:sz w:val="24"/>
+          <w:szCs w:val="24"/>
+          <w14:ligatures w14:val="none"/>
+        </w:rPr>
+      </w:pPr>
+      <w:r>
+        <w:rPr>
+          <w:rFonts w:ascii="Times New Roman" w:eastAsia="Times New Roman" w:hAnsi="Times New Roman" w:cs="Times New Roman"/>
+          <w:kern w:val="0"/>
+          <w:sz w:val="24"/>
+          <w:szCs w:val="24"/>
+          <w14:ligatures w14:val="none"/>
+        </w:rPr>
+        <w:t xml:space="preserve">Conclusion: </w:t>
+      </w:r>
+    </w:p>
+    <w:p>
+      <w:pPr>
+        <w:spacing w:after="0" w:line="240" w:lineRule="auto"/>
+        <w:rPr>
+          <w:rFonts w:ascii="Times New Roman" w:eastAsia="Times New Roman" w:hAnsi="Times New Roman" w:cs="Times New Roman"/>
+          <w:kern w:val="0"/>
+          <w:sz w:val="24"/>
+          <w:szCs w:val="24"/>
+          <w14:ligatures w14:val="none"/>
+        </w:rPr>
+      </w:pPr>
+      <w:r>
+        <w:rPr>
+          <w:rFonts w:ascii="Times New Roman" w:eastAsia="Times New Roman" w:hAnsi="Times New Roman" w:cs="Times New Roman"/>
+          <w:kern w:val="0"/>
+          <w:sz w:val="24"/>
+          <w:szCs w:val="24"/>
+          <w14:ligatures w14:val="none"/>
+        </w:rPr>
+        <w:t xml:space="preserve">The paper proposes a noise-removing method using VMD and HD. The steps of VMD-HD included: </w:t>
+      </w:r>
+    </w:p>
+    <w:p>
+      <w:pPr>
+        <w:pStyle w:val="ListParagraph"/>
+        <w:numPr>
+          <w:ilvl w:val="0"/>
+          <w:numId w:val="1"/>
+        </w:numPr>
+        <w:spacing w:after="0" w:line="240" w:lineRule="auto"/>
+        <w:rPr>
+          <w:rFonts w:ascii="Times New Roman" w:eastAsia="Times New Roman" w:hAnsi="Times New Roman" w:cs="Times New Roman"/>
+          <w:kern w:val="0"/>
+          <w:sz w:val="24"/>
+          <w:szCs w:val="24"/>
+          <w14:ligatures w14:val="none"/>
+        </w:rPr>
+      </w:pPr>
+      <w:r>
+        <w:rPr>
+          <w:rFonts w:ascii="Times New Roman" w:eastAsia="Times New Roman" w:hAnsi="Times New Roman" w:cs="Times New Roman"/>
+          <w:kern w:val="0"/>
+          <w:sz w:val="24"/>
+          <w:szCs w:val="24"/>
+          <w14:ligatures w14:val="none"/>
+        </w:rPr>
+        <w:t>Getting</w:t>
+      </w:r>
+      <w:r>
+        <w:rPr>
+          <w:rFonts w:ascii="Times New Roman" w:eastAsia="Times New Roman" w:hAnsi="Times New Roman" w:cs="Times New Roman"/>
+          <w:kern w:val="0"/>
+          <w:sz w:val="24"/>
+          <w:szCs w:val="24"/>
+          <w14:ligatures w14:val="none"/>
+        </w:rPr>
+        <w:t xml:space="preserve"> BLIMF from noisy signal</w:t>
+      </w:r>
+    </w:p>
+    <w:p>
+      <w:pPr>
+        <w:pStyle w:val="ListParagraph"/>
+        <w:numPr>
+          <w:ilvl w:val="0"/>
+          <w:numId w:val="1"/>
+        </w:numPr>
+        <w:spacing w:after="0" w:line="240" w:lineRule="auto"/>
+        <w:rPr>
+          <w:rFonts w:ascii="Times New Roman" w:eastAsia="Times New Roman" w:hAnsi="Times New Roman" w:cs="Times New Roman"/>
+          <w:kern w:val="0"/>
+          <w:sz w:val="24"/>
+          <w:szCs w:val="24"/>
+          <w14:ligatures w14:val="none"/>
+        </w:rPr>
+      </w:pPr>
+      <w:r>
+        <w:rPr>
+          <w:rFonts w:ascii="Times New Roman" w:eastAsia="Times New Roman" w:hAnsi="Times New Roman" w:cs="Times New Roman"/>
+          <w:kern w:val="0"/>
+          <w:sz w:val="24"/>
+          <w:szCs w:val="24"/>
+          <w14:ligatures w14:val="none"/>
+        </w:rPr>
+        <w:t>Calculate pdf of BLIMF</w:t>
+      </w:r>
+    </w:p>
+    <w:p>
+      <w:pPr>
+        <w:pStyle w:val="ListParagraph"/>
+        <w:numPr>
+          <w:ilvl w:val="0"/>
+          <w:numId w:val="1"/>
+        </w:numPr>
+        <w:spacing w:after="0" w:line="240" w:lineRule="auto"/>
+        <w:rPr>
+          <w:rFonts w:ascii="Times New Roman" w:eastAsia="Times New Roman" w:hAnsi="Times New Roman" w:cs="Times New Roman"/>
+          <w:kern w:val="0"/>
+          <w:sz w:val="24"/>
+          <w:szCs w:val="24"/>
+          <w14:ligatures w14:val="none"/>
+        </w:rPr>
+      </w:pPr>
+      <w:r>
+        <w:rPr>
+          <w:rFonts w:ascii="Times New Roman" w:eastAsia="Times New Roman" w:hAnsi="Times New Roman" w:cs="Times New Roman"/>
+          <w:kern w:val="0"/>
+          <w:sz w:val="24"/>
+          <w:szCs w:val="24"/>
+          <w14:ligatures w14:val="none"/>
+        </w:rPr>
+        <w:t xml:space="preserve">Calculate </w:t>
+      </w:r>
+      <w:r>
+        <w:rPr>
+          <w:rFonts w:ascii="Times New Roman" w:eastAsia="Times New Roman" w:hAnsi="Times New Roman" w:cs="Times New Roman"/>
+          <w:kern w:val="0"/>
+          <w:sz w:val="24"/>
+          <w:szCs w:val="24"/>
+          <w14:ligatures w14:val="none"/>
+        </w:rPr>
+        <w:t xml:space="preserve">the </w:t>
+      </w:r>
+      <w:r>
+        <w:rPr>
+          <w:rFonts w:ascii="Times New Roman" w:eastAsia="Times New Roman" w:hAnsi="Times New Roman" w:cs="Times New Roman"/>
+          <w:kern w:val="0"/>
+          <w:sz w:val="24"/>
+          <w:szCs w:val="24"/>
+          <w14:ligatures w14:val="none"/>
+        </w:rPr>
+        <w:t xml:space="preserve">distance of BLIMF to noisy signal by using HD </w:t>
+      </w:r>
+      <w:proofErr w:type="gramStart"/>
+      <w:r>
+        <w:rPr>
+          <w:rFonts w:ascii="Times New Roman" w:eastAsia="Times New Roman" w:hAnsi="Times New Roman" w:cs="Times New Roman"/>
+          <w:kern w:val="0"/>
+          <w:sz w:val="24"/>
+          <w:szCs w:val="24"/>
+          <w14:ligatures w14:val="none"/>
+        </w:rPr>
+        <w:t>method</w:t>
+      </w:r>
+      <w:proofErr w:type="gramEnd"/>
+    </w:p>
+    <w:p>
+      <w:pPr>
+        <w:pStyle w:val="ListParagraph"/>
+        <w:numPr>
+          <w:ilvl w:val="0"/>
+          <w:numId w:val="1"/>
+        </w:numPr>
+        <w:spacing w:after="0" w:line="240" w:lineRule="auto"/>
+        <w:rPr>
+          <w:rFonts w:ascii="Times New Roman" w:eastAsia="Times New Roman" w:hAnsi="Times New Roman" w:cs="Times New Roman"/>
+          <w:kern w:val="0"/>
+          <w:sz w:val="24"/>
+          <w:szCs w:val="24"/>
+          <w14:ligatures w14:val="none"/>
+        </w:rPr>
+      </w:pPr>
+      <w:r>
+        <w:rPr>
+          <w:rFonts w:ascii="Times New Roman" w:eastAsia="Times New Roman" w:hAnsi="Times New Roman" w:cs="Times New Roman"/>
+          <w:kern w:val="0"/>
+          <w:sz w:val="24"/>
+          <w:szCs w:val="24"/>
+          <w14:ligatures w14:val="none"/>
+        </w:rPr>
+        <w:t>Calculate the absolute slope of 2 near HD and get the filtered signal by summing the one that has the max slope to the 1</w:t>
+      </w:r>
+      <w:r>
+        <w:rPr>
+          <w:rFonts w:ascii="Times New Roman" w:eastAsia="Times New Roman" w:hAnsi="Times New Roman" w:cs="Times New Roman"/>
+          <w:kern w:val="0"/>
+          <w:sz w:val="24"/>
+          <w:szCs w:val="24"/>
+          <w:vertAlign w:val="superscript"/>
+          <w14:ligatures w14:val="none"/>
+        </w:rPr>
+        <w:t>st</w:t>
+      </w:r>
+      <w:r>
+        <w:rPr>
+          <w:rFonts w:ascii="Times New Roman" w:eastAsia="Times New Roman" w:hAnsi="Times New Roman" w:cs="Times New Roman"/>
+          <w:kern w:val="0"/>
+          <w:sz w:val="24"/>
+          <w:szCs w:val="24"/>
+          <w14:ligatures w14:val="none"/>
+        </w:rPr>
+        <w:t xml:space="preserve"> BLIMF.</w:t>
+      </w:r>
+    </w:p>
+    <w:p>
+      <w:pPr>
+        <w:spacing w:after="0" w:line="240" w:lineRule="auto"/>
+        <w:rPr>
+          <w:rFonts w:ascii="Times New Roman" w:eastAsia="Times New Roman" w:hAnsi="Times New Roman" w:cs="Times New Roman"/>
+          <w:kern w:val="0"/>
+          <w:sz w:val="24"/>
+          <w:szCs w:val="24"/>
+          <w14:ligatures w14:val="none"/>
+        </w:rPr>
+      </w:pPr>
+      <w:r>
+        <w:rPr>
+          <w:rFonts w:ascii="Times New Roman" w:eastAsia="Times New Roman" w:hAnsi="Times New Roman" w:cs="Times New Roman"/>
+          <w:kern w:val="0"/>
+          <w:sz w:val="24"/>
+          <w:szCs w:val="24"/>
+          <w14:ligatures w14:val="none"/>
+        </w:rPr>
+        <w:t>The reason for using HD is it is more sensitive to the outlier than the l2-norm.</w:t>
+      </w:r>
+    </w:p>
+    <w:p>
+      <w:pPr>
+        <w:spacing w:after="0" w:line="240" w:lineRule="auto"/>
+        <w:rPr>
+          <w:rFonts w:ascii="Times New Roman" w:eastAsia="Times New Roman" w:hAnsi="Times New Roman" w:cs="Times New Roman"/>
+          <w:kern w:val="0"/>
+          <w:sz w:val="24"/>
+          <w:szCs w:val="24"/>
+          <w14:ligatures w14:val="none"/>
+        </w:rPr>
+      </w:pPr>
+      <w:r>
+        <w:rPr>
+          <w:rFonts w:ascii="Times New Roman" w:eastAsia="Times New Roman" w:hAnsi="Times New Roman" w:cs="Times New Roman"/>
+          <w:kern w:val="0"/>
+          <w:sz w:val="24"/>
+          <w:szCs w:val="24"/>
+          <w14:ligatures w14:val="none"/>
+        </w:rPr>
+        <w:t>The author also compares the results with 2 other methods</w:t>
+      </w:r>
+      <w:r>
+        <w:rPr>
+          <w:rFonts w:ascii="Times New Roman" w:eastAsia="Times New Roman" w:hAnsi="Times New Roman" w:cs="Times New Roman"/>
+          <w:kern w:val="0"/>
+          <w:sz w:val="24"/>
+          <w:szCs w:val="24"/>
+          <w14:ligatures w14:val="none"/>
+        </w:rPr>
+        <w:t>: EMD-HD and EMD-SC</w:t>
+      </w:r>
+      <w:r>
+        <w:rPr>
+          <w:rFonts w:ascii="Times New Roman" w:eastAsia="Times New Roman" w:hAnsi="Times New Roman" w:cs="Times New Roman"/>
+          <w:kern w:val="0"/>
+          <w:sz w:val="24"/>
+          <w:szCs w:val="24"/>
+          <w14:ligatures w14:val="none"/>
+        </w:rPr>
+        <w:t>.</w:t>
+      </w:r>
+    </w:p>
+    <w:p>
+      <w:pPr>
+        <w:spacing w:after="0" w:line="240" w:lineRule="auto"/>
+        <w:rPr>
+          <w:rFonts w:ascii="Times New Roman" w:eastAsia="Times New Roman" w:hAnsi="Times New Roman" w:cs="Times New Roman"/>
+          <w:kern w:val="0"/>
+          <w:sz w:val="24"/>
+          <w:szCs w:val="24"/>
+          <w14:ligatures w14:val="none"/>
+        </w:rPr>
+      </w:pPr>
+    </w:p>
     <w:sectPr>
       <w:pgSz w:w="12240" w:h="15840"/>
       <w:pgMar w:top="1440" w:right="1440" w:bottom="1440" w:left="1440" w:header="720" w:footer="720" w:gutter="0"/>
@@ -662,6 +1538,127 @@
     </w:sectPr>
   </w:body>
 </w:document>
+</file>
+
+<file path=word/numbering.xml><?xml version="1.0" encoding="utf-8"?>
+<w:numbering xmlns:wpc="http://schemas.microsoft.com/office/word/2010/wordprocessingCanvas" xmlns:cx="http://schemas.microsoft.com/office/drawing/2014/chartex" xmlns:cx1="http://schemas.microsoft.com/office/drawing/2015/9/8/chartex" xmlns:cx2="http://schemas.microsoft.com/office/drawing/2015/10/21/chartex" xmlns:cx3="http://schemas.microsoft.com/office/drawing/2016/5/9/chartex" xmlns:cx4="http://schemas.microsoft.com/office/drawing/2016/5/10/chartex" xmlns:cx5="http://schemas.microsoft.com/office/drawing/2016/5/11/chartex" xmlns:cx6="http://schemas.microsoft.com/office/drawing/2016/5/12/chartex" xmlns:cx7="http://schemas.microsoft.com/office/drawing/2016/5/13/chartex" xmlns:cx8="http://schemas.microsoft.com/office/drawing/2016/5/14/chartex" xmlns:mc="http://schemas.openxmlformats.org/markup-compatibility/2006" xmlns:aink="http://schemas.microsoft.com/office/drawing/2016/ink" xmlns:am3d="http://schemas.microsoft.com/office/drawing/2017/model3d" xmlns:o="urn:schemas-microsoft-com:office:office" xmlns:oel="http://schemas.microsoft.com/office/2019/extlst" xmlns:r="http://schemas.openxmlformats.org/officeDocument/2006/relationships" xmlns:m="http://schemas.openxmlformats.org/officeDocument/2006/math" xmlns:v="urn:schemas-microsoft-com:vml" xmlns:wp14="http://schemas.microsoft.com/office/word/2010/wordprocessingDrawing" xmlns:wp="http://schemas.openxmlformats.org/drawingml/2006/wordprocessingDrawing" xmlns:w10="urn:schemas-microsoft-com:office:word" xmlns:w="http://schemas.openxmlformats.org/wordprocessingml/2006/main" xmlns:w14="http://schemas.microsoft.com/office/word/2010/wordml" xmlns:w15="http://schemas.microsoft.com/office/word/2012/wordml" xmlns:w16cex="http://schemas.microsoft.com/office/word/2018/wordml/cex" xmlns:w16cid="http://schemas.microsoft.com/office/word/2016/wordml/cid" xmlns:w16="http://schemas.microsoft.com/office/word/2018/wordml" xmlns:w16sdtdh="http://schemas.microsoft.com/office/word/2020/wordml/sdtdatahash" xmlns:w16se="http://schemas.microsoft.com/office/word/2015/wordml/symex" xmlns:wpg="http://schemas.microsoft.com/office/word/2010/wordprocessingGroup" xmlns:wpi="http://schemas.microsoft.com/office/word/2010/wordprocessingInk" xmlns:wne="http://schemas.microsoft.com/office/word/2006/wordml" xmlns:wps="http://schemas.microsoft.com/office/word/2010/wordprocessingShape" mc:Ignorable="w14 w15 w16se w16cid w16 w16cex w16sdtdh wp14">
+  <w:abstractNum w:abstractNumId="0" w15:restartNumberingAfterBreak="0">
+    <w:nsid w:val="3F2359A5"/>
+    <w:multiLevelType w:val="hybridMultilevel"/>
+    <w:tmpl w:val="8DE06274"/>
+    <w:lvl w:ilvl="0" w:tplc="04090001">
+      <w:start w:val="1"/>
+      <w:numFmt w:val="bullet"/>
+      <w:lvlText w:val=""/>
+      <w:lvlJc w:val="left"/>
+      <w:pPr>
+        <w:ind w:left="720" w:hanging="360"/>
+      </w:pPr>
+      <w:rPr>
+        <w:rFonts w:ascii="Symbol" w:hAnsi="Symbol" w:hint="default"/>
+      </w:rPr>
+    </w:lvl>
+    <w:lvl w:ilvl="1" w:tplc="04090003" w:tentative="1">
+      <w:start w:val="1"/>
+      <w:numFmt w:val="bullet"/>
+      <w:lvlText w:val="o"/>
+      <w:lvlJc w:val="left"/>
+      <w:pPr>
+        <w:ind w:left="1440" w:hanging="360"/>
+      </w:pPr>
+      <w:rPr>
+        <w:rFonts w:ascii="Courier New" w:hAnsi="Courier New" w:cs="Courier New" w:hint="default"/>
+      </w:rPr>
+    </w:lvl>
+    <w:lvl w:ilvl="2" w:tplc="04090005" w:tentative="1">
+      <w:start w:val="1"/>
+      <w:numFmt w:val="bullet"/>
+      <w:lvlText w:val=""/>
+      <w:lvlJc w:val="left"/>
+      <w:pPr>
+        <w:ind w:left="2160" w:hanging="360"/>
+      </w:pPr>
+      <w:rPr>
+        <w:rFonts w:ascii="Wingdings" w:hAnsi="Wingdings" w:hint="default"/>
+      </w:rPr>
+    </w:lvl>
+    <w:lvl w:ilvl="3" w:tplc="04090001" w:tentative="1">
+      <w:start w:val="1"/>
+      <w:numFmt w:val="bullet"/>
+      <w:lvlText w:val=""/>
+      <w:lvlJc w:val="left"/>
+      <w:pPr>
+        <w:ind w:left="2880" w:hanging="360"/>
+      </w:pPr>
+      <w:rPr>
+        <w:rFonts w:ascii="Symbol" w:hAnsi="Symbol" w:hint="default"/>
+      </w:rPr>
+    </w:lvl>
+    <w:lvl w:ilvl="4" w:tplc="04090003" w:tentative="1">
+      <w:start w:val="1"/>
+      <w:numFmt w:val="bullet"/>
+      <w:lvlText w:val="o"/>
+      <w:lvlJc w:val="left"/>
+      <w:pPr>
+        <w:ind w:left="3600" w:hanging="360"/>
+      </w:pPr>
+      <w:rPr>
+        <w:rFonts w:ascii="Courier New" w:hAnsi="Courier New" w:cs="Courier New" w:hint="default"/>
+      </w:rPr>
+    </w:lvl>
+    <w:lvl w:ilvl="5" w:tplc="04090005" w:tentative="1">
+      <w:start w:val="1"/>
+      <w:numFmt w:val="bullet"/>
+      <w:lvlText w:val=""/>
+      <w:lvlJc w:val="left"/>
+      <w:pPr>
+        <w:ind w:left="4320" w:hanging="360"/>
+      </w:pPr>
+      <w:rPr>
+        <w:rFonts w:ascii="Wingdings" w:hAnsi="Wingdings" w:hint="default"/>
+      </w:rPr>
+    </w:lvl>
+    <w:lvl w:ilvl="6" w:tplc="04090001" w:tentative="1">
+      <w:start w:val="1"/>
+      <w:numFmt w:val="bullet"/>
+      <w:lvlText w:val=""/>
+      <w:lvlJc w:val="left"/>
+      <w:pPr>
+        <w:ind w:left="5040" w:hanging="360"/>
+      </w:pPr>
+      <w:rPr>
+        <w:rFonts w:ascii="Symbol" w:hAnsi="Symbol" w:hint="default"/>
+      </w:rPr>
+    </w:lvl>
+    <w:lvl w:ilvl="7" w:tplc="04090003" w:tentative="1">
+      <w:start w:val="1"/>
+      <w:numFmt w:val="bullet"/>
+      <w:lvlText w:val="o"/>
+      <w:lvlJc w:val="left"/>
+      <w:pPr>
+        <w:ind w:left="5760" w:hanging="360"/>
+      </w:pPr>
+      <w:rPr>
+        <w:rFonts w:ascii="Courier New" w:hAnsi="Courier New" w:cs="Courier New" w:hint="default"/>
+      </w:rPr>
+    </w:lvl>
+    <w:lvl w:ilvl="8" w:tplc="04090005" w:tentative="1">
+      <w:start w:val="1"/>
+      <w:numFmt w:val="bullet"/>
+      <w:lvlText w:val=""/>
+      <w:lvlJc w:val="left"/>
+      <w:pPr>
+        <w:ind w:left="6480" w:hanging="360"/>
+      </w:pPr>
+      <w:rPr>
+        <w:rFonts w:ascii="Wingdings" w:hAnsi="Wingdings" w:hint="default"/>
+      </w:rPr>
+    </w:lvl>
+  </w:abstractNum>
+  <w:num w:numId="1" w16cid:durableId="221406606">
+    <w:abstractNumId w:val="0"/>
+  </w:num>
+</w:numbering>
 </file>
 
 <file path=word/styles.xml><?xml version="1.0" encoding="utf-8"?>
@@ -1633,6 +2630,25 @@
       <w14:ligatures w14:val="none"/>
     </w:rPr>
   </w:style>
+  <w:style w:type="table" w:styleId="TableGrid">
+    <w:name w:val="Table Grid"/>
+    <w:basedOn w:val="TableNormal"/>
+    <w:uiPriority w:val="39"/>
+    <w:rsid w:val="00C3746B"/>
+    <w:pPr>
+      <w:spacing w:after="0" w:line="240" w:lineRule="auto"/>
+    </w:pPr>
+    <w:tblPr>
+      <w:tblBorders>
+        <w:top w:val="single" w:sz="4" w:space="0" w:color="auto"/>
+        <w:left w:val="single" w:sz="4" w:space="0" w:color="auto"/>
+        <w:bottom w:val="single" w:sz="4" w:space="0" w:color="auto"/>
+        <w:right w:val="single" w:sz="4" w:space="0" w:color="auto"/>
+        <w:insideH w:val="single" w:sz="4" w:space="0" w:color="auto"/>
+        <w:insideV w:val="single" w:sz="4" w:space="0" w:color="auto"/>
+      </w:tblBorders>
+    </w:tblPr>
+  </w:style>
 </w:styles>
 </file>
 

</xml_diff>